<commit_message>
feat: add deterministic synthetic evaluation corpus
</commit_message>
<xml_diff>
--- a/examples/corpus/demo/components/orquestador.docx
+++ b/examples/corpus/demo/components/orquestador.docx
@@ -12,7 +12,20 @@
     </w:p>
     <w:p>
       <w:r>
-        <w:t>ORQ_DATAOPS controla las dependencias y reintentos de las ETL nocturnas.</w:t>
+        <w:t>ORQ_DATAOPS controla las dependencias de las ETL nocturnas y pertenece a Plataforma de Datos.</w:t>
+      </w:r>
+    </w:p>
+    <w:p>
+      <w:pPr>
+        <w:pStyle w:val="Heading2"/>
+      </w:pPr>
+      <w:r>
+        <w:t>Reintentos</w:t>
+      </w:r>
+    </w:p>
+    <w:p>
+      <w:r>
+        <w:t>Cada ejecución admite dos reintentos automáticos separados por cinco minutos.</w:t>
       </w:r>
     </w:p>
     <w:p>
@@ -25,9 +38,63 @@
     </w:p>
     <w:p>
       <w:r>
-        <w:t>Las ejecuciones se consultan en el panel CONTROL_M.</w:t>
+        <w:t>Las ejecuciones se consultan en CONTROL_M y las alertas críticas usan el código ORQ_CRIT_9.</w:t>
       </w:r>
     </w:p>
+    <w:tbl>
+      <w:tblPr>
+        <w:tblW w:type="auto" w:w="0"/>
+        <w:tblLook w:firstColumn="1" w:firstRow="1" w:lastColumn="0" w:lastRow="0" w:noHBand="0" w:noVBand="1" w:val="04A0"/>
+      </w:tblPr>
+      <w:tblGrid>
+        <w:gridCol w:w="4320"/>
+        <w:gridCol w:w="4320"/>
+      </w:tblGrid>
+      <w:tr>
+        <w:tc>
+          <w:tcPr>
+            <w:tcW w:type="dxa" w:w="4320"/>
+          </w:tcPr>
+          <w:p>
+            <w:r>
+              <w:t>Severidad</w:t>
+            </w:r>
+          </w:p>
+        </w:tc>
+        <w:tc>
+          <w:tcPr>
+            <w:tcW w:type="dxa" w:w="4320"/>
+          </w:tcPr>
+          <w:p>
+            <w:r>
+              <w:t>Canal</w:t>
+            </w:r>
+          </w:p>
+        </w:tc>
+      </w:tr>
+      <w:tr>
+        <w:tc>
+          <w:tcPr>
+            <w:tcW w:type="dxa" w:w="4320"/>
+          </w:tcPr>
+          <w:p>
+            <w:r>
+              <w:t>Crítica</w:t>
+            </w:r>
+          </w:p>
+        </w:tc>
+        <w:tc>
+          <w:tcPr>
+            <w:tcW w:type="dxa" w:w="4320"/>
+          </w:tcPr>
+          <w:p>
+            <w:r>
+              <w:t>DATAOPS_GUARDIA</w:t>
+            </w:r>
+          </w:p>
+        </w:tc>
+      </w:tr>
+    </w:tbl>
     <w:sectPr>
       <w:pgSz w:w="12240" w:h="15840"/>
       <w:pgMar w:top="1440" w:right="1800" w:bottom="1440" w:left="1800" w:header="720" w:footer="720" w:gutter="0"/>

</xml_diff>

<commit_message>
WRK-TASK-026: corpus y gold sets sintéticos (#5)
* feat: add deterministic synthetic evaluation corpus

* docs: complete WRK-TASK-026 evidence
</commit_message>
<xml_diff>
--- a/examples/corpus/demo/components/orquestador.docx
+++ b/examples/corpus/demo/components/orquestador.docx
@@ -12,7 +12,20 @@
     </w:p>
     <w:p>
       <w:r>
-        <w:t>ORQ_DATAOPS controla las dependencias y reintentos de las ETL nocturnas.</w:t>
+        <w:t>ORQ_DATAOPS controla las dependencias de las ETL nocturnas y pertenece a Plataforma de Datos.</w:t>
+      </w:r>
+    </w:p>
+    <w:p>
+      <w:pPr>
+        <w:pStyle w:val="Heading2"/>
+      </w:pPr>
+      <w:r>
+        <w:t>Reintentos</w:t>
+      </w:r>
+    </w:p>
+    <w:p>
+      <w:r>
+        <w:t>Cada ejecución admite dos reintentos automáticos separados por cinco minutos.</w:t>
       </w:r>
     </w:p>
     <w:p>
@@ -25,9 +38,63 @@
     </w:p>
     <w:p>
       <w:r>
-        <w:t>Las ejecuciones se consultan en el panel CONTROL_M.</w:t>
+        <w:t>Las ejecuciones se consultan en CONTROL_M y las alertas críticas usan el código ORQ_CRIT_9.</w:t>
       </w:r>
     </w:p>
+    <w:tbl>
+      <w:tblPr>
+        <w:tblW w:type="auto" w:w="0"/>
+        <w:tblLook w:firstColumn="1" w:firstRow="1" w:lastColumn="0" w:lastRow="0" w:noHBand="0" w:noVBand="1" w:val="04A0"/>
+      </w:tblPr>
+      <w:tblGrid>
+        <w:gridCol w:w="4320"/>
+        <w:gridCol w:w="4320"/>
+      </w:tblGrid>
+      <w:tr>
+        <w:tc>
+          <w:tcPr>
+            <w:tcW w:type="dxa" w:w="4320"/>
+          </w:tcPr>
+          <w:p>
+            <w:r>
+              <w:t>Severidad</w:t>
+            </w:r>
+          </w:p>
+        </w:tc>
+        <w:tc>
+          <w:tcPr>
+            <w:tcW w:type="dxa" w:w="4320"/>
+          </w:tcPr>
+          <w:p>
+            <w:r>
+              <w:t>Canal</w:t>
+            </w:r>
+          </w:p>
+        </w:tc>
+      </w:tr>
+      <w:tr>
+        <w:tc>
+          <w:tcPr>
+            <w:tcW w:type="dxa" w:w="4320"/>
+          </w:tcPr>
+          <w:p>
+            <w:r>
+              <w:t>Crítica</w:t>
+            </w:r>
+          </w:p>
+        </w:tc>
+        <w:tc>
+          <w:tcPr>
+            <w:tcW w:type="dxa" w:w="4320"/>
+          </w:tcPr>
+          <w:p>
+            <w:r>
+              <w:t>DATAOPS_GUARDIA</w:t>
+            </w:r>
+          </w:p>
+        </w:tc>
+      </w:tr>
+    </w:tbl>
     <w:sectPr>
       <w:pgSz w:w="12240" w:h="15840"/>
       <w:pgMar w:top="1440" w:right="1800" w:bottom="1440" w:left="1800" w:header="720" w:footer="720" w:gutter="0"/>

</xml_diff>